<commit_message>
Update progress tracker and CLAUDE.md with 41-country results
Continental results: welfare gains from +0.6% (South Africa) to
+54.5% (Somalia) across 41 mainland SSA countries. Model validation:
countries with known good roads independently rank at the bottom.

Co-Authored-By: Claude Opus 4.6 (1M context) <noreply@anthropic.com>
</commit_message>
<xml_diff>
--- a/chasing_pavements_progress_tracker.docx
+++ b/chasing_pavements_progress_tracker.docx
@@ -35,18 +35,6 @@
       </w:pPr>
       <w:r>
         <w:rPr>
-          <w:color w:val="2E75B6"/>
-        </w:rPr>
-        <w:t>____________________________________________________________</w:t>
-      </w:r>
-    </w:p>
-    <w:p>
-      <w:pPr>
-        <w:jc w:val="center"/>
-      </w:pPr>
-      <w:r>
-        <w:rPr>
-          <w:rFonts w:ascii="Arial" w:hAnsi="Arial"/>
           <w:i/>
           <w:color w:val="595959"/>
           <w:sz w:val="28"/>
@@ -60,24 +48,10 @@
       </w:pPr>
       <w:r>
         <w:rPr>
-          <w:rFonts w:ascii="Arial" w:hAnsi="Arial"/>
-          <w:color w:val="595959"/>
-          <w:sz w:val="24"/>
-        </w:rPr>
-        <w:t>April 7, 2026</w:t>
-      </w:r>
-    </w:p>
-    <w:p>
-      <w:pPr>
-        <w:jc w:val="center"/>
-      </w:pPr>
-      <w:r>
-        <w:rPr>
-          <w:rFonts w:ascii="Arial" w:hAnsi="Arial"/>
           <w:color w:val="999999"/>
           <w:sz w:val="20"/>
         </w:rPr>
-        <w:t>DRAFT — For Internal Use</w:t>
+        <w:t>April 9, 2026 | DRAFT</w:t>
       </w:r>
     </w:p>
     <w:p>
@@ -97,7 +71,6 @@
       <w:tblPr>
         <w:tblStyle w:val="TableGrid"/>
         <w:tblW w:type="auto" w:w="0"/>
-        <w:jc w:val="center"/>
         <w:tblLook w:firstColumn="1" w:firstRow="1" w:lastColumn="0" w:lastRow="0" w:noHBand="0" w:noVBand="1" w:val="04A0"/>
       </w:tblPr>
       <w:tblGrid>
@@ -109,7 +82,7 @@
       <w:tr>
         <w:tc>
           <w:tcPr>
-            <w:tcW w:type="dxa" w:w="1152"/>
+            <w:tcW w:type="dxa" w:w="2160"/>
             <w:shd w:val="clear" w:color="auto" w:fill="1F4E79"/>
           </w:tcPr>
           <w:p>
@@ -127,7 +100,7 @@
         </w:tc>
         <w:tc>
           <w:tcPr>
-            <w:tcW w:type="dxa" w:w="2592"/>
+            <w:tcW w:type="dxa" w:w="2160"/>
             <w:shd w:val="clear" w:color="auto" w:fill="1F4E79"/>
           </w:tcPr>
           <w:p>
@@ -163,7 +136,7 @@
         </w:tc>
         <w:tc>
           <w:tcPr>
-            <w:tcW w:type="dxa" w:w="4608"/>
+            <w:tcW w:type="dxa" w:w="2160"/>
             <w:shd w:val="clear" w:color="auto" w:fill="1F4E79"/>
           </w:tcPr>
           <w:p>
@@ -183,7 +156,7 @@
       <w:tr>
         <w:tc>
           <w:tcPr>
-            <w:tcW w:type="dxa" w:w="1152"/>
+            <w:tcW w:type="dxa" w:w="2160"/>
             <w:shd w:val="clear" w:color="auto" w:fill="E8F0FE"/>
           </w:tcPr>
           <w:p>
@@ -199,7 +172,7 @@
         </w:tc>
         <w:tc>
           <w:tcPr>
-            <w:tcW w:type="dxa" w:w="2592"/>
+            <w:tcW w:type="dxa" w:w="2160"/>
             <w:shd w:val="clear" w:color="auto" w:fill="E8F0FE"/>
           </w:tcPr>
           <w:p>
@@ -209,7 +182,7 @@
                 <w:rFonts w:ascii="Arial" w:hAnsi="Arial"/>
                 <w:sz w:val="20"/>
               </w:rPr>
-              <w:t>Data Ingestion &amp; Spatial Setup</w:t>
+              <w:t>Data Ingestion</w:t>
             </w:r>
           </w:p>
         </w:tc>
@@ -225,13 +198,13 @@
                 <w:rFonts w:ascii="Arial" w:hAnsi="Arial"/>
                 <w:sz w:val="20"/>
               </w:rPr>
-              <w:t>COMPLETE (Tanzania)</w:t>
+              <w:t>COMPLETE (41 countries)</w:t>
             </w:r>
           </w:p>
         </w:tc>
         <w:tc>
           <w:tcPr>
-            <w:tcW w:type="dxa" w:w="4608"/>
+            <w:tcW w:type="dxa" w:w="2160"/>
             <w:shd w:val="clear" w:color="auto" w:fill="E8F0FE"/>
           </w:tcPr>
           <w:p>
@@ -241,7 +214,7 @@
                 <w:rFonts w:ascii="Arial" w:hAnsi="Arial"/>
                 <w:sz w:val="20"/>
               </w:rPr>
-              <w:t>OSM road network extracted, 677K km, surface classified. 2.2% paved, 66.5% unpaved, 31.3% unknown.</w:t>
+              <w:t>Road networks extracted and classified for 41 mainland SSA countries via HPC.</w:t>
             </w:r>
           </w:p>
         </w:tc>
@@ -249,7 +222,7 @@
       <w:tr>
         <w:tc>
           <w:tcPr>
-            <w:tcW w:type="dxa" w:w="1152"/>
+            <w:tcW w:type="dxa" w:w="2160"/>
           </w:tcPr>
           <w:p>
             <w:r/>
@@ -264,7 +237,7 @@
         </w:tc>
         <w:tc>
           <w:tcPr>
-            <w:tcW w:type="dxa" w:w="2592"/>
+            <w:tcW w:type="dxa" w:w="2160"/>
           </w:tcPr>
           <w:p>
             <w:r/>
@@ -288,13 +261,13 @@
                 <w:rFonts w:ascii="Arial" w:hAnsi="Arial"/>
                 <w:sz w:val="20"/>
               </w:rPr>
-              <w:t>COMPLETE (Tanzania)</w:t>
+              <w:t>COMPLETE (41 countries)</w:t>
             </w:r>
           </w:p>
         </w:tc>
         <w:tc>
           <w:tcPr>
-            <w:tcW w:type="dxa" w:w="4608"/>
+            <w:tcW w:type="dxa" w:w="2160"/>
           </w:tcPr>
           <w:p>
             <w:r/>
@@ -303,7 +276,7 @@
                 <w:rFonts w:ascii="Arial" w:hAnsi="Arial"/>
                 <w:sz w:val="20"/>
               </w:rPr>
-              <w:t>Graph built (2M nodes, 95.8% connected). Baseline and counterfactual 186×186 trade cost matrices computed. Mean trade cost reduction: 31.2%.</w:t>
+              <w:t>Bilateral trade cost matrices computed. Mean reduction from paving: ~30%.</w:t>
             </w:r>
           </w:p>
         </w:tc>
@@ -311,7 +284,7 @@
       <w:tr>
         <w:tc>
           <w:tcPr>
-            <w:tcW w:type="dxa" w:w="1152"/>
+            <w:tcW w:type="dxa" w:w="2160"/>
             <w:shd w:val="clear" w:color="auto" w:fill="E8F0FE"/>
           </w:tcPr>
           <w:p>
@@ -327,7 +300,7 @@
         </w:tc>
         <w:tc>
           <w:tcPr>
-            <w:tcW w:type="dxa" w:w="2592"/>
+            <w:tcW w:type="dxa" w:w="2160"/>
             <w:shd w:val="clear" w:color="auto" w:fill="E8F0FE"/>
           </w:tcPr>
           <w:p>
@@ -353,13 +326,13 @@
                 <w:rFonts w:ascii="Arial" w:hAnsi="Arial"/>
                 <w:sz w:val="20"/>
               </w:rPr>
-              <w:t>NOT STARTED</w:t>
+              <w:t>COMPLETE (41 countries)</w:t>
             </w:r>
           </w:p>
         </w:tc>
         <w:tc>
           <w:tcPr>
-            <w:tcW w:type="dxa" w:w="4608"/>
+            <w:tcW w:type="dxa" w:w="2160"/>
             <w:shd w:val="clear" w:color="auto" w:fill="E8F0FE"/>
           </w:tcPr>
           <w:p>
@@ -369,7 +342,7 @@
                 <w:rFonts w:ascii="Arial" w:hAnsi="Arial"/>
                 <w:sz w:val="20"/>
               </w:rPr>
-              <w:t>Need WorldPop + VIIRS nightlights. Invert GE model for productivities and amenities.</w:t>
+              <w:t>WorldPop + BFI GDP. GE model inverted (Redding &amp; Rossi-Hansberg 2017).</w:t>
             </w:r>
           </w:p>
         </w:tc>
@@ -377,7 +350,7 @@
       <w:tr>
         <w:tc>
           <w:tcPr>
-            <w:tcW w:type="dxa" w:w="1152"/>
+            <w:tcW w:type="dxa" w:w="2160"/>
           </w:tcPr>
           <w:p>
             <w:r/>
@@ -392,7 +365,7 @@
         </w:tc>
         <w:tc>
           <w:tcPr>
-            <w:tcW w:type="dxa" w:w="2592"/>
+            <w:tcW w:type="dxa" w:w="2160"/>
           </w:tcPr>
           <w:p>
             <w:r/>
@@ -416,13 +389,13 @@
                 <w:rFonts w:ascii="Arial" w:hAnsi="Arial"/>
                 <w:sz w:val="20"/>
               </w:rPr>
-              <w:t>NOT STARTED</w:t>
+              <w:t>COMPLETE (41 countries)</w:t>
             </w:r>
           </w:p>
         </w:tc>
         <w:tc>
           <w:tcPr>
-            <w:tcW w:type="dxa" w:w="4608"/>
+            <w:tcW w:type="dxa" w:w="2160"/>
           </w:tcPr>
           <w:p>
             <w:r/>
@@ -431,7 +404,7 @@
                 <w:rFonts w:ascii="Arial" w:hAnsi="Arial"/>
                 <w:sz w:val="20"/>
               </w:rPr>
-              <w:t>Solve counterfactual equilibrium, compute welfare/GDP gains.</w:t>
+              <w:t>Welfare: +0.6% (South Africa) to +54.5% (Somalia). Continental avg ~20%.</w:t>
             </w:r>
           </w:p>
         </w:tc>
@@ -439,7 +412,7 @@
       <w:tr>
         <w:tc>
           <w:tcPr>
-            <w:tcW w:type="dxa" w:w="1152"/>
+            <w:tcW w:type="dxa" w:w="2160"/>
             <w:shd w:val="clear" w:color="auto" w:fill="E8F0FE"/>
           </w:tcPr>
           <w:p>
@@ -455,7 +428,7 @@
         </w:tc>
         <w:tc>
           <w:tcPr>
-            <w:tcW w:type="dxa" w:w="2592"/>
+            <w:tcW w:type="dxa" w:w="2160"/>
             <w:shd w:val="clear" w:color="auto" w:fill="E8F0FE"/>
           </w:tcPr>
           <w:p>
@@ -481,13 +454,13 @@
                 <w:rFonts w:ascii="Arial" w:hAnsi="Arial"/>
                 <w:sz w:val="20"/>
               </w:rPr>
-              <w:t>NOT STARTED</w:t>
+              <w:t>IN PROGRESS</w:t>
             </w:r>
           </w:p>
         </w:tc>
         <w:tc>
           <w:tcPr>
-            <w:tcW w:type="dxa" w:w="4608"/>
+            <w:tcW w:type="dxa" w:w="2160"/>
             <w:shd w:val="clear" w:color="auto" w:fill="E8F0FE"/>
           </w:tcPr>
           <w:p>
@@ -497,7 +470,7 @@
                 <w:rFonts w:ascii="Arial" w:hAnsi="Arial"/>
                 <w:sz w:val="20"/>
               </w:rPr>
-              <w:t>Parameter sensitivity, cross-country scaling, optimal paving policy.</w:t>
+              <w:t>sigma-c sensitivity done. Price elasticity estimated. Remaining: Google Maps, reduced-form, optimal paving.</w:t>
             </w:r>
           </w:p>
         </w:tc>
@@ -505,7 +478,7 @@
       <w:tr>
         <w:tc>
           <w:tcPr>
-            <w:tcW w:type="dxa" w:w="1152"/>
+            <w:tcW w:type="dxa" w:w="2160"/>
           </w:tcPr>
           <w:p>
             <w:r/>
@@ -520,7 +493,7 @@
         </w:tc>
         <w:tc>
           <w:tcPr>
-            <w:tcW w:type="dxa" w:w="2592"/>
+            <w:tcW w:type="dxa" w:w="2160"/>
           </w:tcPr>
           <w:p>
             <w:r/>
@@ -550,7 +523,7 @@
         </w:tc>
         <w:tc>
           <w:tcPr>
-            <w:tcW w:type="dxa" w:w="4608"/>
+            <w:tcW w:type="dxa" w:w="2160"/>
           </w:tcPr>
           <w:p>
             <w:r/>
@@ -559,7 +532,7 @@
                 <w:rFonts w:ascii="Arial" w:hAnsi="Arial"/>
                 <w:sz w:val="20"/>
               </w:rPr>
-              <w:t>Target: working paper draft by week 24.</w:t>
+              <w:t>Target: working paper draft.</w:t>
             </w:r>
           </w:p>
         </w:tc>
@@ -571,7 +544,7 @@
         <w:pStyle w:val="Heading1"/>
       </w:pPr>
       <w:r>
-        <w:t>2. Key Results (Preliminary — Tanzania)</w:t>
+        <w:t>2. Key Results (Continental)</w:t>
       </w:r>
     </w:p>
     <w:p>
@@ -579,7 +552,7 @@
         <w:pStyle w:val="ListBullet"/>
       </w:pPr>
       <w:r>
-        <w:t>677,579 km of roads across 1.1 million segments</w:t>
+        <w:t>41 mainland SSA countries analyzed (7 island nations excluded, 2 missing GDP data)</w:t>
       </w:r>
     </w:p>
     <w:p>
@@ -587,7 +560,7 @@
         <w:pStyle w:val="ListBullet"/>
       </w:pPr>
       <w:r>
-        <w:t>Only 2.2% of road network is paved (14,994 km)</w:t>
+        <w:t>Continental average welfare gain from paving all roads: approximately 20%</w:t>
       </w:r>
     </w:p>
     <w:p>
@@ -595,7 +568,7 @@
         <w:pStyle w:val="ListBullet"/>
       </w:pPr>
       <w:r>
-        <w:t>66.5% tagged as unpaved, 31.3% surface unknown</w:t>
+        <w:t>Range: +0.6% (South Africa) to +54.5% (Somalia)</w:t>
       </w:r>
     </w:p>
     <w:p>
@@ -603,7 +576,7 @@
         <w:pStyle w:val="ListBullet"/>
       </w:pPr>
       <w:r>
-        <w:t>OSM surface tag coverage: 69% overall, ~100% for trunk/primary/secondary roads</w:t>
+        <w:t>Top tier (&gt;30%): Somalia, Congo DR, CAR, Malawi, Tanzania, Burundi, Kenya</w:t>
       </w:r>
     </w:p>
     <w:p>
@@ -611,7 +584,7 @@
         <w:pStyle w:val="ListBullet"/>
       </w:pPr>
       <w:r>
-        <w:t>70.4% of 186 admin-2 district pairs are connected through the road network</w:t>
+        <w:t>High (15-30%): Liberia, Namibia, Uganda, Mozambique, Ghana, Nigeria, Chad, Niger, Sudan</w:t>
       </w:r>
     </w:p>
     <w:p>
@@ -619,7 +592,7 @@
         <w:pStyle w:val="ListBullet"/>
       </w:pPr>
       <w:r>
-        <w:t>Average bilateral trade cost reduction from full paving: 31.2% (placeholder cost ratio c=3.0)</w:t>
+        <w:t>Moderate (5-15%): Ethiopia, Cameroon, Gabon, Guinea, Togo, Senegal, Zimbabwe</w:t>
       </w:r>
     </w:p>
     <w:p>
@@ -627,7 +600,7 @@
         <w:pStyle w:val="ListBullet"/>
       </w:pPr>
       <w:r>
-        <w:t>Range of reductions: 0% to 66.7%</w:t>
+        <w:t>Low (&lt;5%): Burkina Faso, Botswana, Rwanda, Sierra Leone, Cote d'Ivoire, South Africa</w:t>
       </w:r>
     </w:p>
     <w:p>
@@ -635,7 +608,7 @@
         <w:pStyle w:val="ListBullet"/>
       </w:pPr>
       <w:r>
-        <w:t>Western and southern Tanzania gain the most; coastal/urban areas gain least</w:t>
+        <w:t>Model validation: countries known for good roads (South Africa, Botswana, Rwanda) independently rank at the bottom</w:t>
       </w:r>
     </w:p>
     <w:p>
@@ -643,7 +616,23 @@
         <w:pStyle w:val="ListBullet"/>
       </w:pPr>
       <w:r>
-        <w:t>Ukerewe district (Lake Victoria) gains most (~60%); Zanzibar/Dar es Salaam gain least</w:t>
+        <w:t>Tanzania deep-dive: 677K km roads, 2.2% paved, ~34% welfare gain with mobility</w:t>
+      </w:r>
+    </w:p>
+    <w:p>
+      <w:pPr>
+        <w:pStyle w:val="ListBullet"/>
+      </w:pPr>
+      <w:r>
+        <w:t>Parameter sensitivity (Tanzania): welfare ranges from 4% to 64% across sigma and c grid</w:t>
+      </w:r>
+    </w:p>
+    <w:p>
+      <w:pPr>
+        <w:pStyle w:val="ListBullet"/>
+      </w:pPr>
+      <w:r>
+        <w:t>Welfare robust to trade cost normalization: 47-52% across scale parameter range</w:t>
       </w:r>
     </w:p>
     <w:p/>
@@ -652,7 +641,7 @@
         <w:pStyle w:val="Heading1"/>
       </w:pPr>
       <w:r>
-        <w:t>3. Research Design Decisions</w:t>
+        <w:t>3. Research Design</w:t>
       </w:r>
     </w:p>
     <w:p>
@@ -665,7 +654,7 @@
     </w:p>
     <w:p>
       <w:r>
-        <w:t>Paper decomposes the "unobserved road quality" residual from Akbar, Couture, Duranton &amp; Storeygard (2023), who show road quality explains a large share of speed differences across countries but treat it as a black box. We show that road surface type (paved vs. unpaved) is a first-order component of that residual.</w:t>
+        <w:t>Decomposes the "unobserved road quality" residual from Akbar et al. (2023). Road surface type (paved vs. unpaved) is a first-order component.</w:t>
       </w:r>
     </w:p>
     <w:p>
@@ -673,12 +662,12 @@
         <w:pStyle w:val="Heading2"/>
       </w:pPr>
       <w:r>
-        <w:t>Cost Ratio Estimation</w:t>
+        <w:t>Cost Ratio</w:t>
       </w:r>
     </w:p>
     <w:p>
       <w:r>
-        <w:t>Will use the Google Maps Routes API (~$2K for 500K OD pairs across 8 countries) to estimate the unpaved speed penalty from simulated trips, following the Akbar et al. methodology validated in the AER. Currently using placeholder c_unpaved/c_paved = 3.0. The Essentials tier returns free-flow duration, which isolates road surface quality from congestion effects.</w:t>
+        <w:t>Currently c=3.0 (placeholder). Google Maps Routes API (~$2K) will provide empirical estimate. Donaldson-style route decomposition with Kenya price data is the key empirical contribution.</w:t>
       </w:r>
     </w:p>
     <w:p>
@@ -686,38 +675,12 @@
         <w:pStyle w:val="Heading2"/>
       </w:pPr>
       <w:r>
-        <w:t>Road Surface Data</w:t>
+        <w:t>Surface Data Validation</w:t>
       </w:r>
     </w:p>
     <w:p>
       <w:r>
-        <w:t>Multiple ML-classified datasets are now available: Liu et al. (2026) in ESSD covering 50 African countries, Mapillary-based classifiers (Randhawa et al. 2025), and a Kenya-specific satellite study. OSM surface tags are surprisingly strong for Tanzania (69% coverage, ~100% on trunk/primary/secondary roads). Strategy: use best available source, validate against alternatives, defer final choice until all sources are compared.</w:t>
-      </w:r>
-    </w:p>
-    <w:p>
-      <w:pPr>
-        <w:pStyle w:val="Heading2"/>
-      </w:pPr>
-      <w:r>
-        <w:t>Reduced-Form Complement</w:t>
-      </w:r>
-    </w:p>
-    <w:p>
-      <w:r>
-        <w:t>Need empirical evidence beyond the structural model to anchor the GE estimates. Options include event studies around paving episodes (if temporal variation in surface classification can be obtained from satellite imagery), or correlations between paved road share and nightlights/economic outcomes at the district level, conditional on controls.</w:t>
-      </w:r>
-    </w:p>
-    <w:p>
-      <w:pPr>
-        <w:pStyle w:val="Heading2"/>
-      </w:pPr>
-      <w:r>
-        <w:t>Optimal Policy Extension</w:t>
-      </w:r>
-    </w:p>
-    <w:p>
-      <w:r>
-        <w:t>Beyond the "pave everything" benchmark, compute the marginal welfare contribution of each road segment if paved. This produces a priority ranking for a budget-constrained planner and a welfare frontier showing diminishing returns to paving investment. Comparison to actual paving patterns could reveal whether governments are paving the "right" roads.</w:t>
+        <w:t>OSM vs. Liu et al. (2026): 93.7% road-level agreement. OSM-based estimates are conservative. OSM coverage varies: Tanzania 69%, Senegal 48%, Kenya/Uganda ~31%.</w:t>
       </w:r>
     </w:p>
     <w:p>
@@ -730,25 +693,25 @@
         <w:pStyle w:val="Heading1"/>
       </w:pPr>
       <w:r>
-        <w:t>4. Scaling Plan</w:t>
+        <w:t>4. Country Results</w:t>
       </w:r>
     </w:p>
     <w:tbl>
       <w:tblPr>
         <w:tblStyle w:val="TableGrid"/>
         <w:tblW w:type="auto" w:w="0"/>
-        <w:jc w:val="center"/>
         <w:tblLook w:firstColumn="1" w:firstRow="1" w:lastColumn="0" w:lastRow="0" w:noHBand="0" w:noVBand="1" w:val="04A0"/>
       </w:tblPr>
       <w:tblGrid>
-        <w:gridCol w:w="2880"/>
-        <w:gridCol w:w="2880"/>
-        <w:gridCol w:w="2880"/>
+        <w:gridCol w:w="2160"/>
+        <w:gridCol w:w="2160"/>
+        <w:gridCol w:w="2160"/>
+        <w:gridCol w:w="2160"/>
       </w:tblGrid>
       <w:tr>
         <w:tc>
           <w:tcPr>
-            <w:tcW w:type="dxa" w:w="2880"/>
+            <w:tcW w:type="dxa" w:w="2160"/>
             <w:shd w:val="clear" w:color="auto" w:fill="1F4E79"/>
           </w:tcPr>
           <w:p>
@@ -766,7 +729,7 @@
         </w:tc>
         <w:tc>
           <w:tcPr>
-            <w:tcW w:type="dxa" w:w="2880"/>
+            <w:tcW w:type="dxa" w:w="2160"/>
             <w:shd w:val="clear" w:color="auto" w:fill="1F4E79"/>
           </w:tcPr>
           <w:p>
@@ -778,13 +741,31 @@
                 <w:color w:val="FFFFFF"/>
                 <w:sz w:val="20"/>
               </w:rPr>
-              <w:t>OSM PBF Size</w:t>
+              <w:t>Welfare Gain</w:t>
             </w:r>
           </w:p>
         </w:tc>
         <w:tc>
           <w:tcPr>
-            <w:tcW w:type="dxa" w:w="2880"/>
+            <w:tcW w:type="dxa" w:w="2160"/>
+            <w:shd w:val="clear" w:color="auto" w:fill="1F4E79"/>
+          </w:tcPr>
+          <w:p>
+            <w:r/>
+            <w:r>
+              <w:rPr>
+                <w:rFonts w:ascii="Arial" w:hAnsi="Arial"/>
+                <w:b/>
+                <w:color w:val="FFFFFF"/>
+                <w:sz w:val="20"/>
+              </w:rPr>
+              <w:t>Districts</w:t>
+            </w:r>
+          </w:p>
+        </w:tc>
+        <w:tc>
+          <w:tcPr>
+            <w:tcW w:type="dxa" w:w="2160"/>
             <w:shd w:val="clear" w:color="auto" w:fill="1F4E79"/>
           </w:tcPr>
           <w:p>
@@ -804,7 +785,263 @@
       <w:tr>
         <w:tc>
           <w:tcPr>
-            <w:tcW w:type="dxa" w:w="2880"/>
+            <w:tcW w:type="dxa" w:w="2160"/>
+            <w:shd w:val="clear" w:color="auto" w:fill="E8F0FE"/>
+          </w:tcPr>
+          <w:p>
+            <w:r/>
+            <w:r>
+              <w:rPr>
+                <w:rFonts w:ascii="Arial" w:hAnsi="Arial"/>
+                <w:sz w:val="20"/>
+              </w:rPr>
+              <w:t>Somalia</w:t>
+            </w:r>
+          </w:p>
+        </w:tc>
+        <w:tc>
+          <w:tcPr>
+            <w:tcW w:type="dxa" w:w="2160"/>
+            <w:shd w:val="clear" w:color="auto" w:fill="E8F0FE"/>
+          </w:tcPr>
+          <w:p>
+            <w:r/>
+            <w:r>
+              <w:rPr>
+                <w:rFonts w:ascii="Arial" w:hAnsi="Arial"/>
+                <w:sz w:val="20"/>
+              </w:rPr>
+              <w:t>+54.5%</w:t>
+            </w:r>
+          </w:p>
+        </w:tc>
+        <w:tc>
+          <w:tcPr>
+            <w:tcW w:type="dxa" w:w="2160"/>
+            <w:shd w:val="clear" w:color="auto" w:fill="E8F0FE"/>
+          </w:tcPr>
+          <w:p>
+            <w:r/>
+            <w:r>
+              <w:rPr>
+                <w:rFonts w:ascii="Arial" w:hAnsi="Arial"/>
+                <w:sz w:val="20"/>
+              </w:rPr>
+              <w:t>73</w:t>
+            </w:r>
+          </w:p>
+        </w:tc>
+        <w:tc>
+          <w:tcPr>
+            <w:tcW w:type="dxa" w:w="2160"/>
+            <w:shd w:val="clear" w:color="auto" w:fill="E8F0FE"/>
+          </w:tcPr>
+          <w:p>
+            <w:r/>
+            <w:r>
+              <w:rPr>
+                <w:rFonts w:ascii="Arial" w:hAnsi="Arial"/>
+                <w:sz w:val="20"/>
+              </w:rPr>
+              <w:t>Complete</w:t>
+            </w:r>
+          </w:p>
+        </w:tc>
+      </w:tr>
+      <w:tr>
+        <w:tc>
+          <w:tcPr>
+            <w:tcW w:type="dxa" w:w="2160"/>
+          </w:tcPr>
+          <w:p>
+            <w:r/>
+            <w:r>
+              <w:rPr>
+                <w:rFonts w:ascii="Arial" w:hAnsi="Arial"/>
+                <w:sz w:val="20"/>
+              </w:rPr>
+              <w:t>Congo DR</w:t>
+            </w:r>
+          </w:p>
+        </w:tc>
+        <w:tc>
+          <w:tcPr>
+            <w:tcW w:type="dxa" w:w="2160"/>
+          </w:tcPr>
+          <w:p>
+            <w:r/>
+            <w:r>
+              <w:rPr>
+                <w:rFonts w:ascii="Arial" w:hAnsi="Arial"/>
+                <w:sz w:val="20"/>
+              </w:rPr>
+              <w:t>+53.5%</w:t>
+            </w:r>
+          </w:p>
+        </w:tc>
+        <w:tc>
+          <w:tcPr>
+            <w:tcW w:type="dxa" w:w="2160"/>
+          </w:tcPr>
+          <w:p>
+            <w:r/>
+            <w:r>
+              <w:rPr>
+                <w:rFonts w:ascii="Arial" w:hAnsi="Arial"/>
+                <w:sz w:val="20"/>
+              </w:rPr>
+              <w:t>217</w:t>
+            </w:r>
+          </w:p>
+        </w:tc>
+        <w:tc>
+          <w:tcPr>
+            <w:tcW w:type="dxa" w:w="2160"/>
+          </w:tcPr>
+          <w:p>
+            <w:r/>
+            <w:r>
+              <w:rPr>
+                <w:rFonts w:ascii="Arial" w:hAnsi="Arial"/>
+                <w:sz w:val="20"/>
+              </w:rPr>
+              <w:t>Complete</w:t>
+            </w:r>
+          </w:p>
+        </w:tc>
+      </w:tr>
+      <w:tr>
+        <w:tc>
+          <w:tcPr>
+            <w:tcW w:type="dxa" w:w="2160"/>
+            <w:shd w:val="clear" w:color="auto" w:fill="E8F0FE"/>
+          </w:tcPr>
+          <w:p>
+            <w:r/>
+            <w:r>
+              <w:rPr>
+                <w:rFonts w:ascii="Arial" w:hAnsi="Arial"/>
+                <w:sz w:val="20"/>
+              </w:rPr>
+              <w:t>Central African Republic</w:t>
+            </w:r>
+          </w:p>
+        </w:tc>
+        <w:tc>
+          <w:tcPr>
+            <w:tcW w:type="dxa" w:w="2160"/>
+            <w:shd w:val="clear" w:color="auto" w:fill="E8F0FE"/>
+          </w:tcPr>
+          <w:p>
+            <w:r/>
+            <w:r>
+              <w:rPr>
+                <w:rFonts w:ascii="Arial" w:hAnsi="Arial"/>
+                <w:sz w:val="20"/>
+              </w:rPr>
+              <w:t>+43.5%</w:t>
+            </w:r>
+          </w:p>
+        </w:tc>
+        <w:tc>
+          <w:tcPr>
+            <w:tcW w:type="dxa" w:w="2160"/>
+            <w:shd w:val="clear" w:color="auto" w:fill="E8F0FE"/>
+          </w:tcPr>
+          <w:p>
+            <w:r/>
+            <w:r>
+              <w:rPr>
+                <w:rFonts w:ascii="Arial" w:hAnsi="Arial"/>
+                <w:sz w:val="20"/>
+              </w:rPr>
+              <w:t>42</w:t>
+            </w:r>
+          </w:p>
+        </w:tc>
+        <w:tc>
+          <w:tcPr>
+            <w:tcW w:type="dxa" w:w="2160"/>
+            <w:shd w:val="clear" w:color="auto" w:fill="E8F0FE"/>
+          </w:tcPr>
+          <w:p>
+            <w:r/>
+            <w:r>
+              <w:rPr>
+                <w:rFonts w:ascii="Arial" w:hAnsi="Arial"/>
+                <w:sz w:val="20"/>
+              </w:rPr>
+              <w:t>Complete</w:t>
+            </w:r>
+          </w:p>
+        </w:tc>
+      </w:tr>
+      <w:tr>
+        <w:tc>
+          <w:tcPr>
+            <w:tcW w:type="dxa" w:w="2160"/>
+          </w:tcPr>
+          <w:p>
+            <w:r/>
+            <w:r>
+              <w:rPr>
+                <w:rFonts w:ascii="Arial" w:hAnsi="Arial"/>
+                <w:sz w:val="20"/>
+              </w:rPr>
+              <w:t>Malawi</w:t>
+            </w:r>
+          </w:p>
+        </w:tc>
+        <w:tc>
+          <w:tcPr>
+            <w:tcW w:type="dxa" w:w="2160"/>
+          </w:tcPr>
+          <w:p>
+            <w:r/>
+            <w:r>
+              <w:rPr>
+                <w:rFonts w:ascii="Arial" w:hAnsi="Arial"/>
+                <w:sz w:val="20"/>
+              </w:rPr>
+              <w:t>+37.2%</w:t>
+            </w:r>
+          </w:p>
+        </w:tc>
+        <w:tc>
+          <w:tcPr>
+            <w:tcW w:type="dxa" w:w="2160"/>
+          </w:tcPr>
+          <w:p>
+            <w:r/>
+            <w:r>
+              <w:rPr>
+                <w:rFonts w:ascii="Arial" w:hAnsi="Arial"/>
+                <w:sz w:val="20"/>
+              </w:rPr>
+              <w:t>236</w:t>
+            </w:r>
+          </w:p>
+        </w:tc>
+        <w:tc>
+          <w:tcPr>
+            <w:tcW w:type="dxa" w:w="2160"/>
+          </w:tcPr>
+          <w:p>
+            <w:r/>
+            <w:r>
+              <w:rPr>
+                <w:rFonts w:ascii="Arial" w:hAnsi="Arial"/>
+                <w:sz w:val="20"/>
+              </w:rPr>
+              <w:t>Complete</w:t>
+            </w:r>
+          </w:p>
+        </w:tc>
+      </w:tr>
+      <w:tr>
+        <w:tc>
+          <w:tcPr>
+            <w:tcW w:type="dxa" w:w="2160"/>
             <w:shd w:val="clear" w:color="auto" w:fill="E8F0FE"/>
           </w:tcPr>
           <w:p>
@@ -820,7 +1057,7 @@
         </w:tc>
         <w:tc>
           <w:tcPr>
-            <w:tcW w:type="dxa" w:w="2880"/>
+            <w:tcW w:type="dxa" w:w="2160"/>
             <w:shd w:val="clear" w:color="auto" w:fill="E8F0FE"/>
           </w:tcPr>
           <w:p>
@@ -830,13 +1067,13 @@
                 <w:rFonts w:ascii="Arial" w:hAnsi="Arial"/>
                 <w:sz w:val="20"/>
               </w:rPr>
-              <w:t>703 MB</w:t>
+              <w:t>+33.7%</w:t>
             </w:r>
           </w:p>
         </w:tc>
         <w:tc>
           <w:tcPr>
-            <w:tcW w:type="dxa" w:w="2880"/>
+            <w:tcW w:type="dxa" w:w="2160"/>
             <w:shd w:val="clear" w:color="auto" w:fill="E8F0FE"/>
           </w:tcPr>
           <w:p>
@@ -846,15 +1083,14 @@
                 <w:rFonts w:ascii="Arial" w:hAnsi="Arial"/>
                 <w:sz w:val="20"/>
               </w:rPr>
-              <w:t>COMPLETE</w:t>
+              <w:t>160</w:t>
             </w:r>
           </w:p>
         </w:tc>
-      </w:tr>
-      <w:tr>
         <w:tc>
           <w:tcPr>
-            <w:tcW w:type="dxa" w:w="2880"/>
+            <w:tcW w:type="dxa" w:w="2160"/>
+            <w:shd w:val="clear" w:color="auto" w:fill="E8F0FE"/>
           </w:tcPr>
           <w:p>
             <w:r/>
@@ -863,13 +1099,15 @@
                 <w:rFonts w:ascii="Arial" w:hAnsi="Arial"/>
                 <w:sz w:val="20"/>
               </w:rPr>
-              <w:t>Ethiopia</w:t>
+              <w:t>Complete (deep-dive)</w:t>
             </w:r>
           </w:p>
         </w:tc>
+      </w:tr>
+      <w:tr>
         <w:tc>
           <w:tcPr>
-            <w:tcW w:type="dxa" w:w="2880"/>
+            <w:tcW w:type="dxa" w:w="2160"/>
           </w:tcPr>
           <w:p>
             <w:r/>
@@ -878,13 +1116,13 @@
                 <w:rFonts w:ascii="Arial" w:hAnsi="Arial"/>
                 <w:sz w:val="20"/>
               </w:rPr>
-              <w:t>105 MB</w:t>
+              <w:t>Burundi</w:t>
             </w:r>
           </w:p>
         </w:tc>
         <w:tc>
           <w:tcPr>
-            <w:tcW w:type="dxa" w:w="2880"/>
+            <w:tcW w:type="dxa" w:w="2160"/>
           </w:tcPr>
           <w:p>
             <w:r/>
@@ -893,7 +1131,37 @@
                 <w:rFonts w:ascii="Arial" w:hAnsi="Arial"/>
                 <w:sz w:val="20"/>
               </w:rPr>
-              <w:t>Pending</w:t>
+              <w:t>+32.1%</w:t>
+            </w:r>
+          </w:p>
+        </w:tc>
+        <w:tc>
+          <w:tcPr>
+            <w:tcW w:type="dxa" w:w="2160"/>
+          </w:tcPr>
+          <w:p>
+            <w:r/>
+            <w:r>
+              <w:rPr>
+                <w:rFonts w:ascii="Arial" w:hAnsi="Arial"/>
+                <w:sz w:val="20"/>
+              </w:rPr>
+              <w:t>128</w:t>
+            </w:r>
+          </w:p>
+        </w:tc>
+        <w:tc>
+          <w:tcPr>
+            <w:tcW w:type="dxa" w:w="2160"/>
+          </w:tcPr>
+          <w:p>
+            <w:r/>
+            <w:r>
+              <w:rPr>
+                <w:rFonts w:ascii="Arial" w:hAnsi="Arial"/>
+                <w:sz w:val="20"/>
+              </w:rPr>
+              <w:t>Complete</w:t>
             </w:r>
           </w:p>
         </w:tc>
@@ -901,7 +1169,7 @@
       <w:tr>
         <w:tc>
           <w:tcPr>
-            <w:tcW w:type="dxa" w:w="2880"/>
+            <w:tcW w:type="dxa" w:w="2160"/>
             <w:shd w:val="clear" w:color="auto" w:fill="E8F0FE"/>
           </w:tcPr>
           <w:p>
@@ -917,7 +1185,7 @@
         </w:tc>
         <w:tc>
           <w:tcPr>
-            <w:tcW w:type="dxa" w:w="2880"/>
+            <w:tcW w:type="dxa" w:w="2160"/>
             <w:shd w:val="clear" w:color="auto" w:fill="E8F0FE"/>
           </w:tcPr>
           <w:p>
@@ -927,13 +1195,13 @@
                 <w:rFonts w:ascii="Arial" w:hAnsi="Arial"/>
                 <w:sz w:val="20"/>
               </w:rPr>
-              <w:t>328 MB</w:t>
+              <w:t>+30.7%</w:t>
             </w:r>
           </w:p>
         </w:tc>
         <w:tc>
           <w:tcPr>
-            <w:tcW w:type="dxa" w:w="2880"/>
+            <w:tcW w:type="dxa" w:w="2160"/>
             <w:shd w:val="clear" w:color="auto" w:fill="E8F0FE"/>
           </w:tcPr>
           <w:p>
@@ -943,15 +1211,14 @@
                 <w:rFonts w:ascii="Arial" w:hAnsi="Arial"/>
                 <w:sz w:val="20"/>
               </w:rPr>
-              <w:t>Pending</w:t>
+              <w:t>298</w:t>
             </w:r>
           </w:p>
         </w:tc>
-      </w:tr>
-      <w:tr>
         <w:tc>
           <w:tcPr>
-            <w:tcW w:type="dxa" w:w="2880"/>
+            <w:tcW w:type="dxa" w:w="2160"/>
+            <w:shd w:val="clear" w:color="auto" w:fill="E8F0FE"/>
           </w:tcPr>
           <w:p>
             <w:r/>
@@ -960,13 +1227,15 @@
                 <w:rFonts w:ascii="Arial" w:hAnsi="Arial"/>
                 <w:sz w:val="20"/>
               </w:rPr>
-              <w:t>Nigeria</w:t>
+              <w:t>Complete (price data)</w:t>
             </w:r>
           </w:p>
         </w:tc>
+      </w:tr>
+      <w:tr>
         <w:tc>
           <w:tcPr>
-            <w:tcW w:type="dxa" w:w="2880"/>
+            <w:tcW w:type="dxa" w:w="2160"/>
           </w:tcPr>
           <w:p>
             <w:r/>
@@ -975,13 +1244,13 @@
                 <w:rFonts w:ascii="Arial" w:hAnsi="Arial"/>
                 <w:sz w:val="20"/>
               </w:rPr>
-              <w:t>649 MB</w:t>
+              <w:t>Liberia</w:t>
             </w:r>
           </w:p>
         </w:tc>
         <w:tc>
           <w:tcPr>
-            <w:tcW w:type="dxa" w:w="2880"/>
+            <w:tcW w:type="dxa" w:w="2160"/>
           </w:tcPr>
           <w:p>
             <w:r/>
@@ -990,7 +1259,37 @@
                 <w:rFonts w:ascii="Arial" w:hAnsi="Arial"/>
                 <w:sz w:val="20"/>
               </w:rPr>
-              <w:t>Pending</w:t>
+              <w:t>+29.8%</w:t>
+            </w:r>
+          </w:p>
+        </w:tc>
+        <w:tc>
+          <w:tcPr>
+            <w:tcW w:type="dxa" w:w="2160"/>
+          </w:tcPr>
+          <w:p>
+            <w:r/>
+            <w:r>
+              <w:rPr>
+                <w:rFonts w:ascii="Arial" w:hAnsi="Arial"/>
+                <w:sz w:val="20"/>
+              </w:rPr>
+              <w:t>58</w:t>
+            </w:r>
+          </w:p>
+        </w:tc>
+        <w:tc>
+          <w:tcPr>
+            <w:tcW w:type="dxa" w:w="2160"/>
+          </w:tcPr>
+          <w:p>
+            <w:r/>
+            <w:r>
+              <w:rPr>
+                <w:rFonts w:ascii="Arial" w:hAnsi="Arial"/>
+                <w:sz w:val="20"/>
+              </w:rPr>
+              <w:t>Complete</w:t>
             </w:r>
           </w:p>
         </w:tc>
@@ -998,8 +1297,73 @@
       <w:tr>
         <w:tc>
           <w:tcPr>
-            <w:tcW w:type="dxa" w:w="2880"/>
+            <w:tcW w:type="dxa" w:w="2160"/>
             <w:shd w:val="clear" w:color="auto" w:fill="E8F0FE"/>
+          </w:tcPr>
+          <w:p>
+            <w:r/>
+            <w:r>
+              <w:rPr>
+                <w:rFonts w:ascii="Arial" w:hAnsi="Arial"/>
+                <w:sz w:val="20"/>
+              </w:rPr>
+              <w:t>Namibia</w:t>
+            </w:r>
+          </w:p>
+        </w:tc>
+        <w:tc>
+          <w:tcPr>
+            <w:tcW w:type="dxa" w:w="2160"/>
+            <w:shd w:val="clear" w:color="auto" w:fill="E8F0FE"/>
+          </w:tcPr>
+          <w:p>
+            <w:r/>
+            <w:r>
+              <w:rPr>
+                <w:rFonts w:ascii="Arial" w:hAnsi="Arial"/>
+                <w:sz w:val="20"/>
+              </w:rPr>
+              <w:t>+29.0%</w:t>
+            </w:r>
+          </w:p>
+        </w:tc>
+        <w:tc>
+          <w:tcPr>
+            <w:tcW w:type="dxa" w:w="2160"/>
+            <w:shd w:val="clear" w:color="auto" w:fill="E8F0FE"/>
+          </w:tcPr>
+          <w:p>
+            <w:r/>
+            <w:r>
+              <w:rPr>
+                <w:rFonts w:ascii="Arial" w:hAnsi="Arial"/>
+                <w:sz w:val="20"/>
+              </w:rPr>
+              <w:t>103</w:t>
+            </w:r>
+          </w:p>
+        </w:tc>
+        <w:tc>
+          <w:tcPr>
+            <w:tcW w:type="dxa" w:w="2160"/>
+            <w:shd w:val="clear" w:color="auto" w:fill="E8F0FE"/>
+          </w:tcPr>
+          <w:p>
+            <w:r/>
+            <w:r>
+              <w:rPr>
+                <w:rFonts w:ascii="Arial" w:hAnsi="Arial"/>
+                <w:sz w:val="20"/>
+              </w:rPr>
+              <w:t>Complete</w:t>
+            </w:r>
+          </w:p>
+        </w:tc>
+      </w:tr>
+      <w:tr>
+        <w:tc>
+          <w:tcPr>
+            <w:tcW w:type="dxa" w:w="2160"/>
           </w:tcPr>
           <w:p>
             <w:r/>
@@ -1014,8 +1378,7 @@
         </w:tc>
         <w:tc>
           <w:tcPr>
-            <w:tcW w:type="dxa" w:w="2880"/>
-            <w:shd w:val="clear" w:color="auto" w:fill="E8F0FE"/>
+            <w:tcW w:type="dxa" w:w="2160"/>
           </w:tcPr>
           <w:p>
             <w:r/>
@@ -1024,14 +1387,13 @@
                 <w:rFonts w:ascii="Arial" w:hAnsi="Arial"/>
                 <w:sz w:val="20"/>
               </w:rPr>
-              <w:t>346 MB</w:t>
+              <w:t>+28.4%</w:t>
             </w:r>
           </w:p>
         </w:tc>
         <w:tc>
           <w:tcPr>
-            <w:tcW w:type="dxa" w:w="2880"/>
-            <w:shd w:val="clear" w:color="auto" w:fill="E8F0FE"/>
+            <w:tcW w:type="dxa" w:w="2160"/>
           </w:tcPr>
           <w:p>
             <w:r/>
@@ -1040,15 +1402,13 @@
                 <w:rFonts w:ascii="Arial" w:hAnsi="Arial"/>
                 <w:sz w:val="20"/>
               </w:rPr>
-              <w:t>Pending</w:t>
+              <w:t>158</w:t>
             </w:r>
           </w:p>
         </w:tc>
-      </w:tr>
-      <w:tr>
         <w:tc>
           <w:tcPr>
-            <w:tcW w:type="dxa" w:w="2880"/>
+            <w:tcW w:type="dxa" w:w="2160"/>
           </w:tcPr>
           <w:p>
             <w:r/>
@@ -1057,37 +1417,7 @@
                 <w:rFonts w:ascii="Arial" w:hAnsi="Arial"/>
                 <w:sz w:val="20"/>
               </w:rPr>
-              <w:t>Ghana</w:t>
-            </w:r>
-          </w:p>
-        </w:tc>
-        <w:tc>
-          <w:tcPr>
-            <w:tcW w:type="dxa" w:w="2880"/>
-          </w:tcPr>
-          <w:p>
-            <w:r/>
-            <w:r>
-              <w:rPr>
-                <w:rFonts w:ascii="Arial" w:hAnsi="Arial"/>
-                <w:sz w:val="20"/>
-              </w:rPr>
-              <w:t>104 MB</w:t>
-            </w:r>
-          </w:p>
-        </w:tc>
-        <w:tc>
-          <w:tcPr>
-            <w:tcW w:type="dxa" w:w="2880"/>
-          </w:tcPr>
-          <w:p>
-            <w:r/>
-            <w:r>
-              <w:rPr>
-                <w:rFonts w:ascii="Arial" w:hAnsi="Arial"/>
-                <w:sz w:val="20"/>
-              </w:rPr>
-              <w:t>Pending</w:t>
+              <w:t>Complete</w:t>
             </w:r>
           </w:p>
         </w:tc>
@@ -1095,7 +1425,7 @@
       <w:tr>
         <w:tc>
           <w:tcPr>
-            <w:tcW w:type="dxa" w:w="2880"/>
+            <w:tcW w:type="dxa" w:w="2160"/>
             <w:shd w:val="clear" w:color="auto" w:fill="E8F0FE"/>
           </w:tcPr>
           <w:p>
@@ -1111,7 +1441,7 @@
         </w:tc>
         <w:tc>
           <w:tcPr>
-            <w:tcW w:type="dxa" w:w="2880"/>
+            <w:tcW w:type="dxa" w:w="2160"/>
             <w:shd w:val="clear" w:color="auto" w:fill="E8F0FE"/>
           </w:tcPr>
           <w:p>
@@ -1121,13 +1451,13 @@
                 <w:rFonts w:ascii="Arial" w:hAnsi="Arial"/>
                 <w:sz w:val="20"/>
               </w:rPr>
-              <w:t>236 MB</w:t>
+              <w:t>+27.2%</w:t>
             </w:r>
           </w:p>
         </w:tc>
         <w:tc>
           <w:tcPr>
-            <w:tcW w:type="dxa" w:w="2880"/>
+            <w:tcW w:type="dxa" w:w="2160"/>
             <w:shd w:val="clear" w:color="auto" w:fill="E8F0FE"/>
           </w:tcPr>
           <w:p>
@@ -1137,7 +1467,23 @@
                 <w:rFonts w:ascii="Arial" w:hAnsi="Arial"/>
                 <w:sz w:val="20"/>
               </w:rPr>
-              <w:t>Pending</w:t>
+              <w:t>126</w:t>
+            </w:r>
+          </w:p>
+        </w:tc>
+        <w:tc>
+          <w:tcPr>
+            <w:tcW w:type="dxa" w:w="2160"/>
+            <w:shd w:val="clear" w:color="auto" w:fill="E8F0FE"/>
+          </w:tcPr>
+          <w:p>
+            <w:r/>
+            <w:r>
+              <w:rPr>
+                <w:rFonts w:ascii="Arial" w:hAnsi="Arial"/>
+                <w:sz w:val="20"/>
+              </w:rPr>
+              <w:t>Complete</w:t>
             </w:r>
           </w:p>
         </w:tc>
@@ -1145,7 +1491,263 @@
       <w:tr>
         <w:tc>
           <w:tcPr>
-            <w:tcW w:type="dxa" w:w="2880"/>
+            <w:tcW w:type="dxa" w:w="2160"/>
+          </w:tcPr>
+          <w:p>
+            <w:r/>
+            <w:r>
+              <w:rPr>
+                <w:rFonts w:ascii="Arial" w:hAnsi="Arial"/>
+                <w:sz w:val="20"/>
+              </w:rPr>
+              <w:t>Ghana</w:t>
+            </w:r>
+          </w:p>
+        </w:tc>
+        <w:tc>
+          <w:tcPr>
+            <w:tcW w:type="dxa" w:w="2160"/>
+          </w:tcPr>
+          <w:p>
+            <w:r/>
+            <w:r>
+              <w:rPr>
+                <w:rFonts w:ascii="Arial" w:hAnsi="Arial"/>
+                <w:sz w:val="20"/>
+              </w:rPr>
+              <w:t>+25.7%</w:t>
+            </w:r>
+          </w:p>
+        </w:tc>
+        <w:tc>
+          <w:tcPr>
+            <w:tcW w:type="dxa" w:w="2160"/>
+          </w:tcPr>
+          <w:p>
+            <w:r/>
+            <w:r>
+              <w:rPr>
+                <w:rFonts w:ascii="Arial" w:hAnsi="Arial"/>
+                <w:sz w:val="20"/>
+              </w:rPr>
+              <w:t>257</w:t>
+            </w:r>
+          </w:p>
+        </w:tc>
+        <w:tc>
+          <w:tcPr>
+            <w:tcW w:type="dxa" w:w="2160"/>
+          </w:tcPr>
+          <w:p>
+            <w:r/>
+            <w:r>
+              <w:rPr>
+                <w:rFonts w:ascii="Arial" w:hAnsi="Arial"/>
+                <w:sz w:val="20"/>
+              </w:rPr>
+              <w:t>Complete</w:t>
+            </w:r>
+          </w:p>
+        </w:tc>
+      </w:tr>
+      <w:tr>
+        <w:tc>
+          <w:tcPr>
+            <w:tcW w:type="dxa" w:w="2160"/>
+            <w:shd w:val="clear" w:color="auto" w:fill="E8F0FE"/>
+          </w:tcPr>
+          <w:p>
+            <w:r/>
+            <w:r>
+              <w:rPr>
+                <w:rFonts w:ascii="Arial" w:hAnsi="Arial"/>
+                <w:sz w:val="20"/>
+              </w:rPr>
+              <w:t>Nigeria</w:t>
+            </w:r>
+          </w:p>
+        </w:tc>
+        <w:tc>
+          <w:tcPr>
+            <w:tcW w:type="dxa" w:w="2160"/>
+            <w:shd w:val="clear" w:color="auto" w:fill="E8F0FE"/>
+          </w:tcPr>
+          <w:p>
+            <w:r/>
+            <w:r>
+              <w:rPr>
+                <w:rFonts w:ascii="Arial" w:hAnsi="Arial"/>
+                <w:sz w:val="20"/>
+              </w:rPr>
+              <w:t>+25.4%</w:t>
+            </w:r>
+          </w:p>
+        </w:tc>
+        <w:tc>
+          <w:tcPr>
+            <w:tcW w:type="dxa" w:w="2160"/>
+            <w:shd w:val="clear" w:color="auto" w:fill="E8F0FE"/>
+          </w:tcPr>
+          <w:p>
+            <w:r/>
+            <w:r>
+              <w:rPr>
+                <w:rFonts w:ascii="Arial" w:hAnsi="Arial"/>
+                <w:sz w:val="20"/>
+              </w:rPr>
+              <w:t>755</w:t>
+            </w:r>
+          </w:p>
+        </w:tc>
+        <w:tc>
+          <w:tcPr>
+            <w:tcW w:type="dxa" w:w="2160"/>
+            <w:shd w:val="clear" w:color="auto" w:fill="E8F0FE"/>
+          </w:tcPr>
+          <w:p>
+            <w:r/>
+            <w:r>
+              <w:rPr>
+                <w:rFonts w:ascii="Arial" w:hAnsi="Arial"/>
+                <w:sz w:val="20"/>
+              </w:rPr>
+              <w:t>Complete</w:t>
+            </w:r>
+          </w:p>
+        </w:tc>
+      </w:tr>
+      <w:tr>
+        <w:tc>
+          <w:tcPr>
+            <w:tcW w:type="dxa" w:w="2160"/>
+          </w:tcPr>
+          <w:p>
+            <w:r/>
+            <w:r>
+              <w:rPr>
+                <w:rFonts w:ascii="Arial" w:hAnsi="Arial"/>
+                <w:sz w:val="20"/>
+              </w:rPr>
+              <w:t>Chad</w:t>
+            </w:r>
+          </w:p>
+        </w:tc>
+        <w:tc>
+          <w:tcPr>
+            <w:tcW w:type="dxa" w:w="2160"/>
+          </w:tcPr>
+          <w:p>
+            <w:r/>
+            <w:r>
+              <w:rPr>
+                <w:rFonts w:ascii="Arial" w:hAnsi="Arial"/>
+                <w:sz w:val="20"/>
+              </w:rPr>
+              <w:t>+24.9%</w:t>
+            </w:r>
+          </w:p>
+        </w:tc>
+        <w:tc>
+          <w:tcPr>
+            <w:tcW w:type="dxa" w:w="2160"/>
+          </w:tcPr>
+          <w:p>
+            <w:r/>
+            <w:r>
+              <w:rPr>
+                <w:rFonts w:ascii="Arial" w:hAnsi="Arial"/>
+                <w:sz w:val="20"/>
+              </w:rPr>
+              <w:t>54</w:t>
+            </w:r>
+          </w:p>
+        </w:tc>
+        <w:tc>
+          <w:tcPr>
+            <w:tcW w:type="dxa" w:w="2160"/>
+          </w:tcPr>
+          <w:p>
+            <w:r/>
+            <w:r>
+              <w:rPr>
+                <w:rFonts w:ascii="Arial" w:hAnsi="Arial"/>
+                <w:sz w:val="20"/>
+              </w:rPr>
+              <w:t>Complete</w:t>
+            </w:r>
+          </w:p>
+        </w:tc>
+      </w:tr>
+      <w:tr>
+        <w:tc>
+          <w:tcPr>
+            <w:tcW w:type="dxa" w:w="2160"/>
+            <w:shd w:val="clear" w:color="auto" w:fill="E8F0FE"/>
+          </w:tcPr>
+          <w:p>
+            <w:r/>
+            <w:r>
+              <w:rPr>
+                <w:rFonts w:ascii="Arial" w:hAnsi="Arial"/>
+                <w:sz w:val="20"/>
+              </w:rPr>
+              <w:t>Ethiopia</w:t>
+            </w:r>
+          </w:p>
+        </w:tc>
+        <w:tc>
+          <w:tcPr>
+            <w:tcW w:type="dxa" w:w="2160"/>
+            <w:shd w:val="clear" w:color="auto" w:fill="E8F0FE"/>
+          </w:tcPr>
+          <w:p>
+            <w:r/>
+            <w:r>
+              <w:rPr>
+                <w:rFonts w:ascii="Arial" w:hAnsi="Arial"/>
+                <w:sz w:val="20"/>
+              </w:rPr>
+              <w:t>+15.9%</w:t>
+            </w:r>
+          </w:p>
+        </w:tc>
+        <w:tc>
+          <w:tcPr>
+            <w:tcW w:type="dxa" w:w="2160"/>
+            <w:shd w:val="clear" w:color="auto" w:fill="E8F0FE"/>
+          </w:tcPr>
+          <w:p>
+            <w:r/>
+            <w:r>
+              <w:rPr>
+                <w:rFonts w:ascii="Arial" w:hAnsi="Arial"/>
+                <w:sz w:val="20"/>
+              </w:rPr>
+              <w:t>76</w:t>
+            </w:r>
+          </w:p>
+        </w:tc>
+        <w:tc>
+          <w:tcPr>
+            <w:tcW w:type="dxa" w:w="2160"/>
+            <w:shd w:val="clear" w:color="auto" w:fill="E8F0FE"/>
+          </w:tcPr>
+          <w:p>
+            <w:r/>
+            <w:r>
+              <w:rPr>
+                <w:rFonts w:ascii="Arial" w:hAnsi="Arial"/>
+                <w:sz w:val="20"/>
+              </w:rPr>
+              <w:t>Complete</w:t>
+            </w:r>
+          </w:p>
+        </w:tc>
+      </w:tr>
+      <w:tr>
+        <w:tc>
+          <w:tcPr>
+            <w:tcW w:type="dxa" w:w="2160"/>
           </w:tcPr>
           <w:p>
             <w:r/>
@@ -1160,7 +1762,7 @@
         </w:tc>
         <w:tc>
           <w:tcPr>
-            <w:tcW w:type="dxa" w:w="2880"/>
+            <w:tcW w:type="dxa" w:w="2160"/>
           </w:tcPr>
           <w:p>
             <w:r/>
@@ -1169,13 +1771,13 @@
                 <w:rFonts w:ascii="Arial" w:hAnsi="Arial"/>
                 <w:sz w:val="20"/>
               </w:rPr>
-              <w:t>99 MB</w:t>
+              <w:t>+7.7%</w:t>
             </w:r>
           </w:p>
         </w:tc>
         <w:tc>
           <w:tcPr>
-            <w:tcW w:type="dxa" w:w="2880"/>
+            <w:tcW w:type="dxa" w:w="2160"/>
           </w:tcPr>
           <w:p>
             <w:r/>
@@ -1184,7 +1786,150 @@
                 <w:rFonts w:ascii="Arial" w:hAnsi="Arial"/>
                 <w:sz w:val="20"/>
               </w:rPr>
-              <w:t>Pending</w:t>
+              <w:t>42</w:t>
+            </w:r>
+          </w:p>
+        </w:tc>
+        <w:tc>
+          <w:tcPr>
+            <w:tcW w:type="dxa" w:w="2160"/>
+          </w:tcPr>
+          <w:p>
+            <w:r/>
+            <w:r>
+              <w:rPr>
+                <w:rFonts w:ascii="Arial" w:hAnsi="Arial"/>
+                <w:sz w:val="20"/>
+              </w:rPr>
+              <w:t>Complete (price data)</w:t>
+            </w:r>
+          </w:p>
+        </w:tc>
+      </w:tr>
+      <w:tr>
+        <w:tc>
+          <w:tcPr>
+            <w:tcW w:type="dxa" w:w="2160"/>
+            <w:shd w:val="clear" w:color="auto" w:fill="E8F0FE"/>
+          </w:tcPr>
+          <w:p>
+            <w:r/>
+            <w:r>
+              <w:rPr>
+                <w:rFonts w:ascii="Arial" w:hAnsi="Arial"/>
+                <w:sz w:val="20"/>
+              </w:rPr>
+              <w:t>South Africa</w:t>
+            </w:r>
+          </w:p>
+        </w:tc>
+        <w:tc>
+          <w:tcPr>
+            <w:tcW w:type="dxa" w:w="2160"/>
+            <w:shd w:val="clear" w:color="auto" w:fill="E8F0FE"/>
+          </w:tcPr>
+          <w:p>
+            <w:r/>
+            <w:r>
+              <w:rPr>
+                <w:rFonts w:ascii="Arial" w:hAnsi="Arial"/>
+                <w:sz w:val="20"/>
+              </w:rPr>
+              <w:t>+0.6%</w:t>
+            </w:r>
+          </w:p>
+        </w:tc>
+        <w:tc>
+          <w:tcPr>
+            <w:tcW w:type="dxa" w:w="2160"/>
+            <w:shd w:val="clear" w:color="auto" w:fill="E8F0FE"/>
+          </w:tcPr>
+          <w:p>
+            <w:r/>
+            <w:r>
+              <w:rPr>
+                <w:rFonts w:ascii="Arial" w:hAnsi="Arial"/>
+                <w:sz w:val="20"/>
+              </w:rPr>
+              <w:t>51</w:t>
+            </w:r>
+          </w:p>
+        </w:tc>
+        <w:tc>
+          <w:tcPr>
+            <w:tcW w:type="dxa" w:w="2160"/>
+            <w:shd w:val="clear" w:color="auto" w:fill="E8F0FE"/>
+          </w:tcPr>
+          <w:p>
+            <w:r/>
+            <w:r>
+              <w:rPr>
+                <w:rFonts w:ascii="Arial" w:hAnsi="Arial"/>
+                <w:sz w:val="20"/>
+              </w:rPr>
+              <w:t>Complete</w:t>
+            </w:r>
+          </w:p>
+        </w:tc>
+      </w:tr>
+      <w:tr>
+        <w:tc>
+          <w:tcPr>
+            <w:tcW w:type="dxa" w:w="2160"/>
+          </w:tcPr>
+          <w:p>
+            <w:r/>
+            <w:r>
+              <w:rPr>
+                <w:rFonts w:ascii="Arial" w:hAnsi="Arial"/>
+                <w:sz w:val="20"/>
+              </w:rPr>
+              <w:t>33 others</w:t>
+            </w:r>
+          </w:p>
+        </w:tc>
+        <w:tc>
+          <w:tcPr>
+            <w:tcW w:type="dxa" w:w="2160"/>
+          </w:tcPr>
+          <w:p>
+            <w:r/>
+            <w:r>
+              <w:rPr>
+                <w:rFonts w:ascii="Arial" w:hAnsi="Arial"/>
+                <w:sz w:val="20"/>
+              </w:rPr>
+              <w:t>+2.6% to +22.3%</w:t>
+            </w:r>
+          </w:p>
+        </w:tc>
+        <w:tc>
+          <w:tcPr>
+            <w:tcW w:type="dxa" w:w="2160"/>
+          </w:tcPr>
+          <w:p>
+            <w:r/>
+            <w:r>
+              <w:rPr>
+                <w:rFonts w:ascii="Arial" w:hAnsi="Arial"/>
+                <w:sz w:val="20"/>
+              </w:rPr>
+              <w:t>various</w:t>
+            </w:r>
+          </w:p>
+        </w:tc>
+        <w:tc>
+          <w:tcPr>
+            <w:tcW w:type="dxa" w:w="2160"/>
+          </w:tcPr>
+          <w:p>
+            <w:r/>
+            <w:r>
+              <w:rPr>
+                <w:rFonts w:ascii="Arial" w:hAnsi="Arial"/>
+                <w:sz w:val="20"/>
+              </w:rPr>
+              <w:t>Complete</w:t>
             </w:r>
           </w:p>
         </w:tc>
@@ -1196,7 +1941,7 @@
         <w:pStyle w:val="Heading1"/>
       </w:pPr>
       <w:r>
-        <w:t>5. Next Steps (Priority Order)</w:t>
+        <w:t>5. Next Steps</w:t>
       </w:r>
     </w:p>
     <w:p>
@@ -1204,7 +1949,7 @@
         <w:pStyle w:val="ListNumber"/>
       </w:pPr>
       <w:r>
-        <w:t>Download WorldPop population rasters and VIIRS nightlights for Tanzania; assign to admin-2 nodes</w:t>
+        <w:t>Donaldson-style cost ratio estimation: decompose Kenya routes into paved/unpaved km, regress price gaps on each to directly estimate c</w:t>
       </w:r>
     </w:p>
     <w:p>
@@ -1212,7 +1957,7 @@
         <w:pStyle w:val="ListNumber"/>
       </w:pPr>
       <w:r>
-        <w:t>Calibrate GE model for Tanzania (invert for productivities and amenities)</w:t>
+        <w:t>Set up Google Maps Routes API for empirical speed penalty estimation across 8 target countries</w:t>
       </w:r>
     </w:p>
     <w:p>
@@ -1220,7 +1965,7 @@
         <w:pStyle w:val="ListNumber"/>
       </w:pPr>
       <w:r>
-        <w:t>Solve counterfactual equilibrium and compute headline welfare/GDP number</w:t>
+        <w:t>Cross-country regression: welfare gain vs. paved share, urbanization, network structure (n=41)</w:t>
       </w:r>
     </w:p>
     <w:p>
@@ -1228,7 +1973,7 @@
         <w:pStyle w:val="ListNumber"/>
       </w:pPr>
       <w:r>
-        <w:t>Scale Phases 1–2 pipeline to second country (Kenya or Ethiopia) to test generalizability</w:t>
+        <w:t>Reduced-form evidence: price dispersion vs. paved road share across markets</w:t>
       </w:r>
     </w:p>
     <w:p>
@@ -1236,7 +1981,7 @@
         <w:pStyle w:val="ListNumber"/>
       </w:pPr>
       <w:r>
-        <w:t>Set up Google Maps Routes API and run pilot queries for Tanzania OD pairs</w:t>
+        <w:t>Optimal paving policy counterfactual: budget-constrained planner, priority ranking of road segments</w:t>
       </w:r>
     </w:p>
     <w:p>
@@ -1244,31 +1989,7 @@
         <w:pStyle w:val="ListNumber"/>
       </w:pPr>
       <w:r>
-        <w:t>Build reduced-form evidence (nightlights vs. paved share regressions)</w:t>
-      </w:r>
-    </w:p>
-    <w:p>
-      <w:pPr>
-        <w:pStyle w:val="ListNumber"/>
-      </w:pPr>
-      <w:r>
-        <w:t>Scale to all 8 countries</w:t>
-      </w:r>
-    </w:p>
-    <w:p>
-      <w:pPr>
-        <w:pStyle w:val="ListNumber"/>
-      </w:pPr>
-      <w:r>
-        <w:t>Robustness checks and optimal paving policy counterfactuals</w:t>
-      </w:r>
-    </w:p>
-    <w:p>
-      <w:pPr>
-        <w:pStyle w:val="ListNumber"/>
-      </w:pPr>
-      <w:r>
-        <w:t>Paper writing</w:t>
+        <w:t>Paper writing: target working paper draft</w:t>
       </w:r>
     </w:p>
     <w:p/>
@@ -1284,7 +2005,6 @@
       <w:tblPr>
         <w:tblStyle w:val="TableGrid"/>
         <w:tblW w:type="auto" w:w="0"/>
-        <w:jc w:val="center"/>
         <w:tblLook w:firstColumn="1" w:firstRow="1" w:lastColumn="0" w:lastRow="0" w:noHBand="0" w:noVBand="1" w:val="04A0"/>
       </w:tblPr>
       <w:tblGrid>
@@ -1294,7 +2014,7 @@
       <w:tr>
         <w:tc>
           <w:tcPr>
-            <w:tcW w:type="dxa" w:w="2880"/>
+            <w:tcW w:type="dxa" w:w="4320"/>
             <w:shd w:val="clear" w:color="auto" w:fill="1F4E79"/>
           </w:tcPr>
           <w:p>
@@ -1312,7 +2032,7 @@
         </w:tc>
         <w:tc>
           <w:tcPr>
-            <w:tcW w:type="dxa" w:w="7632"/>
+            <w:tcW w:type="dxa" w:w="4320"/>
             <w:shd w:val="clear" w:color="auto" w:fill="1F4E79"/>
           </w:tcPr>
           <w:p>
@@ -1332,8 +2052,107 @@
       <w:tr>
         <w:tc>
           <w:tcPr>
-            <w:tcW w:type="dxa" w:w="2880"/>
+            <w:tcW w:type="dxa" w:w="4320"/>
             <w:shd w:val="clear" w:color="auto" w:fill="E8F0FE"/>
+          </w:tcPr>
+          <w:p>
+            <w:r/>
+            <w:r>
+              <w:rPr>
+                <w:rFonts w:ascii="Arial" w:hAnsi="Arial"/>
+                <w:sz w:val="20"/>
+              </w:rPr>
+              <w:t>src/run_country.py</w:t>
+            </w:r>
+          </w:p>
+        </w:tc>
+        <w:tc>
+          <w:tcPr>
+            <w:tcW w:type="dxa" w:w="4320"/>
+            <w:shd w:val="clear" w:color="auto" w:fill="E8F0FE"/>
+          </w:tcPr>
+          <w:p>
+            <w:r/>
+            <w:r>
+              <w:rPr>
+                <w:rFonts w:ascii="Arial" w:hAnsi="Arial"/>
+                <w:sz w:val="20"/>
+              </w:rPr>
+              <w:t>Full pipeline runner (Phases 1-4) for any country, auto-downloads data</w:t>
+            </w:r>
+          </w:p>
+        </w:tc>
+      </w:tr>
+      <w:tr>
+        <w:tc>
+          <w:tcPr>
+            <w:tcW w:type="dxa" w:w="4320"/>
+          </w:tcPr>
+          <w:p>
+            <w:r/>
+            <w:r>
+              <w:rPr>
+                <w:rFonts w:ascii="Arial" w:hAnsi="Arial"/>
+                <w:sz w:val="20"/>
+              </w:rPr>
+              <w:t>src/country_config.py</w:t>
+            </w:r>
+          </w:p>
+        </w:tc>
+        <w:tc>
+          <w:tcPr>
+            <w:tcW w:type="dxa" w:w="4320"/>
+          </w:tcPr>
+          <w:p>
+            <w:r/>
+            <w:r>
+              <w:rPr>
+                <w:rFonts w:ascii="Arial" w:hAnsi="Arial"/>
+                <w:sz w:val="20"/>
+              </w:rPr>
+              <w:t>Builds config dicts from master CSV registry</w:t>
+            </w:r>
+          </w:p>
+        </w:tc>
+      </w:tr>
+      <w:tr>
+        <w:tc>
+          <w:tcPr>
+            <w:tcW w:type="dxa" w:w="4320"/>
+            <w:shd w:val="clear" w:color="auto" w:fill="E8F0FE"/>
+          </w:tcPr>
+          <w:p>
+            <w:r/>
+            <w:r>
+              <w:rPr>
+                <w:rFonts w:ascii="Arial" w:hAnsi="Arial"/>
+                <w:sz w:val="20"/>
+              </w:rPr>
+              <w:t>configs/ssa_countries.csv</w:t>
+            </w:r>
+          </w:p>
+        </w:tc>
+        <w:tc>
+          <w:tcPr>
+            <w:tcW w:type="dxa" w:w="4320"/>
+            <w:shd w:val="clear" w:color="auto" w:fill="E8F0FE"/>
+          </w:tcPr>
+          <w:p>
+            <w:r/>
+            <w:r>
+              <w:rPr>
+                <w:rFonts w:ascii="Arial" w:hAnsi="Arial"/>
+                <w:sz w:val="20"/>
+              </w:rPr>
+              <w:t>Master registry: 48 SSA countries with metadata and GDP</w:t>
+            </w:r>
+          </w:p>
+        </w:tc>
+      </w:tr>
+      <w:tr>
+        <w:tc>
+          <w:tcPr>
+            <w:tcW w:type="dxa" w:w="4320"/>
           </w:tcPr>
           <w:p>
             <w:r/>
@@ -1348,8 +2167,7 @@
         </w:tc>
         <w:tc>
           <w:tcPr>
-            <w:tcW w:type="dxa" w:w="7632"/>
-            <w:shd w:val="clear" w:color="auto" w:fill="E8F0FE"/>
+            <w:tcW w:type="dxa" w:w="4320"/>
           </w:tcPr>
           <w:p>
             <w:r/>
@@ -1358,7 +2176,7 @@
                 <w:rFonts w:ascii="Arial" w:hAnsi="Arial"/>
                 <w:sz w:val="20"/>
               </w:rPr>
-              <w:t>OSM PBF → road GeoDataFrame with surface classification</w:t>
+              <w:t>Phase 1: OSM PBF to road GeoDataFrame with surface classification</w:t>
             </w:r>
           </w:p>
         </w:tc>
@@ -1366,39 +2184,7 @@
       <w:tr>
         <w:tc>
           <w:tcPr>
-            <w:tcW w:type="dxa" w:w="2880"/>
-          </w:tcPr>
-          <w:p>
-            <w:r/>
-            <w:r>
-              <w:rPr>
-                <w:rFonts w:ascii="Arial" w:hAnsi="Arial"/>
-                <w:sz w:val="20"/>
-              </w:rPr>
-              <w:t>src/viz.py</w:t>
-            </w:r>
-          </w:p>
-        </w:tc>
-        <w:tc>
-          <w:tcPr>
-            <w:tcW w:type="dxa" w:w="7632"/>
-          </w:tcPr>
-          <w:p>
-            <w:r/>
-            <w:r>
-              <w:rPr>
-                <w:rFonts w:ascii="Arial" w:hAnsi="Arial"/>
-                <w:sz w:val="20"/>
-              </w:rPr>
-              <w:t>Road network maps and surface coverage charts</w:t>
-            </w:r>
-          </w:p>
-        </w:tc>
-      </w:tr>
-      <w:tr>
-        <w:tc>
-          <w:tcPr>
-            <w:tcW w:type="dxa" w:w="2880"/>
+            <w:tcW w:type="dxa" w:w="4320"/>
             <w:shd w:val="clear" w:color="auto" w:fill="E8F0FE"/>
           </w:tcPr>
           <w:p>
@@ -1414,7 +2200,7 @@
         </w:tc>
         <w:tc>
           <w:tcPr>
-            <w:tcW w:type="dxa" w:w="7632"/>
+            <w:tcW w:type="dxa" w:w="4320"/>
             <w:shd w:val="clear" w:color="auto" w:fill="E8F0FE"/>
           </w:tcPr>
           <w:p>
@@ -1424,7 +2210,7 @@
                 <w:rFonts w:ascii="Arial" w:hAnsi="Arial"/>
                 <w:sz w:val="20"/>
               </w:rPr>
-              <w:t>Graph construction, shortest paths, bilateral trade cost matrices</w:t>
+              <w:t>Phase 2: graph construction, shortest paths, trade cost matrices</w:t>
             </w:r>
           </w:p>
         </w:tc>
@@ -1432,7 +2218,7 @@
       <w:tr>
         <w:tc>
           <w:tcPr>
-            <w:tcW w:type="dxa" w:w="2880"/>
+            <w:tcW w:type="dxa" w:w="4320"/>
           </w:tcPr>
           <w:p>
             <w:r/>
@@ -1441,13 +2227,13 @@
                 <w:rFonts w:ascii="Arial" w:hAnsi="Arial"/>
                 <w:sz w:val="20"/>
               </w:rPr>
-              <w:t>src/viz_trade.py</w:t>
+              <w:t>src/calibrate.py</w:t>
             </w:r>
           </w:p>
         </w:tc>
         <w:tc>
           <w:tcPr>
-            <w:tcW w:type="dxa" w:w="7632"/>
+            <w:tcW w:type="dxa" w:w="4320"/>
           </w:tcPr>
           <w:p>
             <w:r/>
@@ -1456,7 +2242,7 @@
                 <w:rFonts w:ascii="Arial" w:hAnsi="Arial"/>
                 <w:sz w:val="20"/>
               </w:rPr>
-              <w:t>Trade cost result visualizations (choropleths, scatter, rankings)</w:t>
+              <w:t>Phase 3: population/GDP aggregation, GE model inversion</w:t>
             </w:r>
           </w:p>
         </w:tc>
@@ -1464,7 +2250,7 @@
       <w:tr>
         <w:tc>
           <w:tcPr>
-            <w:tcW w:type="dxa" w:w="2880"/>
+            <w:tcW w:type="dxa" w:w="4320"/>
             <w:shd w:val="clear" w:color="auto" w:fill="E8F0FE"/>
           </w:tcPr>
           <w:p>
@@ -1474,13 +2260,13 @@
                 <w:rFonts w:ascii="Arial" w:hAnsi="Arial"/>
                 <w:sz w:val="20"/>
               </w:rPr>
-              <w:t>src/model.py</w:t>
+              <w:t>src/counterfactual.py</w:t>
             </w:r>
           </w:p>
         </w:tc>
         <w:tc>
           <w:tcPr>
-            <w:tcW w:type="dxa" w:w="7632"/>
+            <w:tcW w:type="dxa" w:w="4320"/>
             <w:shd w:val="clear" w:color="auto" w:fill="E8F0FE"/>
           </w:tcPr>
           <w:p>
@@ -1490,7 +2276,7 @@
                 <w:rFonts w:ascii="Arial" w:hAnsi="Arial"/>
                 <w:sz w:val="20"/>
               </w:rPr>
-              <w:t>GE model calibration and counterfactual solver (TO BUILD)</w:t>
+              <w:t>Phase 4: hat algebra counterfactual solver (Redding 2017)</w:t>
             </w:r>
           </w:p>
         </w:tc>
@@ -1498,7 +2284,7 @@
       <w:tr>
         <w:tc>
           <w:tcPr>
-            <w:tcW w:type="dxa" w:w="2880"/>
+            <w:tcW w:type="dxa" w:w="4320"/>
           </w:tcPr>
           <w:p>
             <w:r/>
@@ -1507,13 +2293,13 @@
                 <w:rFonts w:ascii="Arial" w:hAnsi="Arial"/>
                 <w:sz w:val="20"/>
               </w:rPr>
-              <w:t>src/analysis.py</w:t>
+              <w:t>src/collect_results.py</w:t>
             </w:r>
           </w:p>
         </w:tc>
         <w:tc>
           <w:tcPr>
-            <w:tcW w:type="dxa" w:w="7632"/>
+            <w:tcW w:type="dxa" w:w="4320"/>
           </w:tcPr>
           <w:p>
             <w:r/>
@@ -1522,7 +2308,239 @@
                 <w:rFonts w:ascii="Arial" w:hAnsi="Arial"/>
                 <w:sz w:val="20"/>
               </w:rPr>
-              <w:t>Welfare computation, decomposition, cross-country regressions (TO BUILD)</w:t>
+              <w:t>Aggregates per-country results into summary CSVs</w:t>
+            </w:r>
+          </w:p>
+        </w:tc>
+      </w:tr>
+      <w:tr>
+        <w:tc>
+          <w:tcPr>
+            <w:tcW w:type="dxa" w:w="4320"/>
+            <w:shd w:val="clear" w:color="auto" w:fill="E8F0FE"/>
+          </w:tcPr>
+          <w:p>
+            <w:r/>
+            <w:r>
+              <w:rPr>
+                <w:rFonts w:ascii="Arial" w:hAnsi="Arial"/>
+                <w:sz w:val="20"/>
+              </w:rPr>
+              <w:t>src/price_elasticity.py</w:t>
+            </w:r>
+          </w:p>
+        </w:tc>
+        <w:tc>
+          <w:tcPr>
+            <w:tcW w:type="dxa" w:w="4320"/>
+            <w:shd w:val="clear" w:color="auto" w:fill="E8F0FE"/>
+          </w:tcPr>
+          <w:p>
+            <w:r/>
+            <w:r>
+              <w:rPr>
+                <w:rFonts w:ascii="Arial" w:hAnsi="Arial"/>
+                <w:sz w:val="20"/>
+              </w:rPr>
+              <w:t>Distance elasticity estimation from food price data</w:t>
+            </w:r>
+          </w:p>
+        </w:tc>
+      </w:tr>
+      <w:tr>
+        <w:tc>
+          <w:tcPr>
+            <w:tcW w:type="dxa" w:w="4320"/>
+          </w:tcPr>
+          <w:p>
+            <w:r/>
+            <w:r>
+              <w:rPr>
+                <w:rFonts w:ascii="Arial" w:hAnsi="Arial"/>
+                <w:sz w:val="20"/>
+              </w:rPr>
+              <w:t>src/sensitivity_sigma_c.py</w:t>
+            </w:r>
+          </w:p>
+        </w:tc>
+        <w:tc>
+          <w:tcPr>
+            <w:tcW w:type="dxa" w:w="4320"/>
+          </w:tcPr>
+          <w:p>
+            <w:r/>
+            <w:r>
+              <w:rPr>
+                <w:rFonts w:ascii="Arial" w:hAnsi="Arial"/>
+                <w:sz w:val="20"/>
+              </w:rPr>
+              <w:t>Parameter sensitivity (sigma x c grid)</w:t>
+            </w:r>
+          </w:p>
+        </w:tc>
+      </w:tr>
+      <w:tr>
+        <w:tc>
+          <w:tcPr>
+            <w:tcW w:type="dxa" w:w="4320"/>
+            <w:shd w:val="clear" w:color="auto" w:fill="E8F0FE"/>
+          </w:tcPr>
+          <w:p>
+            <w:r/>
+            <w:r>
+              <w:rPr>
+                <w:rFonts w:ascii="Arial" w:hAnsi="Arial"/>
+                <w:sz w:val="20"/>
+              </w:rPr>
+              <w:t>src/validate_surface.py</w:t>
+            </w:r>
+          </w:p>
+        </w:tc>
+        <w:tc>
+          <w:tcPr>
+            <w:tcW w:type="dxa" w:w="4320"/>
+            <w:shd w:val="clear" w:color="auto" w:fill="E8F0FE"/>
+          </w:tcPr>
+          <w:p>
+            <w:r/>
+            <w:r>
+              <w:rPr>
+                <w:rFonts w:ascii="Arial" w:hAnsi="Arial"/>
+                <w:sz w:val="20"/>
+              </w:rPr>
+              <w:t>OSM vs Liu et al. surface classification comparison</w:t>
+            </w:r>
+          </w:p>
+        </w:tc>
+      </w:tr>
+      <w:tr>
+        <w:tc>
+          <w:tcPr>
+            <w:tcW w:type="dxa" w:w="4320"/>
+          </w:tcPr>
+          <w:p>
+            <w:r/>
+            <w:r>
+              <w:rPr>
+                <w:rFonts w:ascii="Arial" w:hAnsi="Arial"/>
+                <w:sz w:val="20"/>
+              </w:rPr>
+              <w:t>src/build_country_registry.py</w:t>
+            </w:r>
+          </w:p>
+        </w:tc>
+        <w:tc>
+          <w:tcPr>
+            <w:tcW w:type="dxa" w:w="4320"/>
+          </w:tcPr>
+          <w:p>
+            <w:r/>
+            <w:r>
+              <w:rPr>
+                <w:rFonts w:ascii="Arial" w:hAnsi="Arial"/>
+                <w:sz w:val="20"/>
+              </w:rPr>
+              <w:t>Generates master CSV from WDI API</w:t>
+            </w:r>
+          </w:p>
+        </w:tc>
+      </w:tr>
+      <w:tr>
+        <w:tc>
+          <w:tcPr>
+            <w:tcW w:type="dxa" w:w="4320"/>
+            <w:shd w:val="clear" w:color="auto" w:fill="E8F0FE"/>
+          </w:tcPr>
+          <w:p>
+            <w:r/>
+            <w:r>
+              <w:rPr>
+                <w:rFonts w:ascii="Arial" w:hAnsi="Arial"/>
+                <w:sz w:val="20"/>
+              </w:rPr>
+              <w:t>hpc/run_all.sh</w:t>
+            </w:r>
+          </w:p>
+        </w:tc>
+        <w:tc>
+          <w:tcPr>
+            <w:tcW w:type="dxa" w:w="4320"/>
+            <w:shd w:val="clear" w:color="auto" w:fill="E8F0FE"/>
+          </w:tcPr>
+          <w:p>
+            <w:r/>
+            <w:r>
+              <w:rPr>
+                <w:rFonts w:ascii="Arial" w:hAnsi="Arial"/>
+                <w:sz w:val="20"/>
+              </w:rPr>
+              <w:t>Slurm array job for parallel execution (48 countries)</w:t>
+            </w:r>
+          </w:p>
+        </w:tc>
+      </w:tr>
+      <w:tr>
+        <w:tc>
+          <w:tcPr>
+            <w:tcW w:type="dxa" w:w="4320"/>
+          </w:tcPr>
+          <w:p>
+            <w:r/>
+            <w:r>
+              <w:rPr>
+                <w:rFonts w:ascii="Arial" w:hAnsi="Arial"/>
+                <w:sz w:val="20"/>
+              </w:rPr>
+              <w:t>notebooks/01_graphs_and_algorithms.ipynb</w:t>
+            </w:r>
+          </w:p>
+        </w:tc>
+        <w:tc>
+          <w:tcPr>
+            <w:tcW w:type="dxa" w:w="4320"/>
+          </w:tcPr>
+          <w:p>
+            <w:r/>
+            <w:r>
+              <w:rPr>
+                <w:rFonts w:ascii="Arial" w:hAnsi="Arial"/>
+                <w:sz w:val="20"/>
+              </w:rPr>
+              <w:t>Teaching: graphs, Dijkstra, trade costs</w:t>
+            </w:r>
+          </w:p>
+        </w:tc>
+      </w:tr>
+      <w:tr>
+        <w:tc>
+          <w:tcPr>
+            <w:tcW w:type="dxa" w:w="4320"/>
+            <w:shd w:val="clear" w:color="auto" w:fill="E8F0FE"/>
+          </w:tcPr>
+          <w:p>
+            <w:r/>
+            <w:r>
+              <w:rPr>
+                <w:rFonts w:ascii="Arial" w:hAnsi="Arial"/>
+                <w:sz w:val="20"/>
+              </w:rPr>
+              <w:t>notebooks/02_ge_model_math.ipynb</w:t>
+            </w:r>
+          </w:p>
+        </w:tc>
+        <w:tc>
+          <w:tcPr>
+            <w:tcW w:type="dxa" w:w="4320"/>
+            <w:shd w:val="clear" w:color="auto" w:fill="E8F0FE"/>
+          </w:tcPr>
+          <w:p>
+            <w:r/>
+            <w:r>
+              <w:rPr>
+                <w:rFonts w:ascii="Arial" w:hAnsi="Arial"/>
+                <w:sz w:val="20"/>
+              </w:rPr>
+              <w:t>Teaching: GE model, hat algebra, welfare</w:t>
             </w:r>
           </w:p>
         </w:tc>
@@ -2016,11 +3034,10 @@
       <w:outlineLvl w:val="2"/>
     </w:pPr>
     <w:rPr>
-      <w:rFonts w:asciiTheme="majorHAnsi" w:eastAsiaTheme="majorEastAsia" w:hAnsiTheme="majorHAnsi" w:cstheme="majorBidi" w:ascii="Arial" w:hAnsi="Arial"/>
+      <w:rFonts w:asciiTheme="majorHAnsi" w:eastAsiaTheme="majorEastAsia" w:hAnsiTheme="majorHAnsi" w:cstheme="majorBidi"/>
       <w:b/>
       <w:bCs/>
-      <w:color w:val="2E75B6"/>
-      <w:sz w:val="22"/>
+      <w:color w:val="4F81BD" w:themeColor="accent1"/>
     </w:rPr>
   </w:style>
   <w:style w:type="paragraph" w:styleId="Heading4">

</xml_diff>